<commit_message>
Regenerate legal policy Word docs from current markdown sources.
Includes the rewritten Seller Handbook. If Word had 09_Seller_Handbook.docx open, the new copy is saved as 09_Seller_Handbook_UPDATED.docx until the locked file is closed.

Co-authored-by: Cursor <cursoragent@cursor.com>
</commit_message>
<xml_diff>
--- a/docs/legal/02_Privacy_Policy.docx
+++ b/docs/legal/02_Privacy_Policy.docx
@@ -2,50 +2,6 @@
 <file path=word/document.xml><?xml version="1.0" encoding="utf-8"?>
 <w:document xmlns:wpc="http://schemas.microsoft.com/office/word/2010/wordprocessingCanvas" xmlns:mo="http://schemas.microsoft.com/office/mac/office/2008/main" xmlns:mc="http://schemas.openxmlformats.org/markup-compatibility/2006" xmlns:mv="urn:schemas-microsoft-com:mac:vml" xmlns:o="urn:schemas-microsoft-com:office:office" xmlns:r="http://schemas.openxmlformats.org/officeDocument/2006/relationships" xmlns:m="http://schemas.openxmlformats.org/officeDocument/2006/math" xmlns:v="urn:schemas-microsoft-com:vml" xmlns:wp14="http://schemas.microsoft.com/office/word/2010/wordprocessingDrawing" xmlns:wp="http://schemas.openxmlformats.org/drawingml/2006/wordprocessingDrawing" xmlns:w10="urn:schemas-microsoft-com:office:word" xmlns:w="http://schemas.openxmlformats.org/wordprocessingml/2006/main" xmlns:w14="http://schemas.microsoft.com/office/word/2010/wordml" xmlns:wpg="http://schemas.microsoft.com/office/word/2010/wordprocessingGroup" xmlns:wpi="http://schemas.microsoft.com/office/word/2010/wordprocessingInk" xmlns:wne="http://schemas.microsoft.com/office/word/2006/wordml" xmlns:wps="http://schemas.microsoft.com/office/word/2010/wordprocessingShape" mc:Ignorable="w14 wp14">
   <w:body>
-    <w:tbl>
-      <w:tblPr>
-        <w:tblStyle w:val="TableGrid"/>
-        <w:tblW w:type="auto" w:w="0"/>
-        <w:tblLook w:firstColumn="1" w:firstRow="1" w:lastColumn="0" w:lastRow="0" w:noHBand="0" w:noVBand="1" w:val="04A0"/>
-      </w:tblPr>
-      <w:tblGrid>
-        <w:gridCol w:w="8640"/>
-      </w:tblGrid>
-      <w:tr>
-        <w:tc>
-          <w:tcPr>
-            <w:tcW w:type="dxa" w:w="8640"/>
-            <w:shd w:fill="FFF8E1"/>
-          </w:tcPr>
-          <w:p>
-            <w:pPr>
-              <w:jc w:val="center"/>
-            </w:pPr>
-            <w:r>
-              <w:rPr>
-                <w:b/>
-                <w:color w:val="B86E00"/>
-              </w:rPr>
-              <w:t>◆ INSERT: LOGO HERE (optional, top of policy) ◆</w:t>
-            </w:r>
-          </w:p>
-          <w:p>
-            <w:pPr>
-              <w:jc w:val="center"/>
-            </w:pPr>
-            <w:r>
-              <w:rPr>
-                <w:i/>
-                <w:color w:val="555555"/>
-                <w:sz w:val="18"/>
-              </w:rPr>
-              <w:t>Insert → Pictures</w:t>
-            </w:r>
-          </w:p>
-        </w:tc>
-      </w:tr>
-    </w:tbl>
-    <w:p/>
     <w:p>
       <w:pPr>
         <w:jc w:val="center"/>
@@ -53,10 +9,22 @@
       <w:r>
         <w:rPr>
           <w:b/>
-          <w:color w:val="B86E00"/>
-          <w:sz w:val="32"/>
+          <w:color w:val="1B5E20"/>
+          <w:sz w:val="36"/>
         </w:rPr>
-        <w:t>[COMPANY LEGAL NAME]</w:t>
+        <w:t>DanyPathMart</w:t>
+      </w:r>
+    </w:p>
+    <w:p>
+      <w:pPr>
+        <w:jc w:val="center"/>
+      </w:pPr>
+      <w:r>
+        <w:rPr>
+          <w:color w:val="555555"/>
+          <w:sz w:val="20"/>
+        </w:rPr>
+        <w:t>https://danypathmart.store</w:t>
       </w:r>
     </w:p>
     <w:p/>
@@ -76,19 +44,13 @@
         <w:rPr>
           <w:b/>
         </w:rPr>
-        <w:t xml:space="preserve">Effective date: </w:t>
+        <w:t xml:space="preserve">Last updated: </w:t>
       </w:r>
       <w:r>
-        <w:t>[EFFECTIVE DATE]</w:t>
+        <w:t>July 2026</w:t>
       </w:r>
       <w:r>
-        <w:t xml:space="preserve">  ·  Last updated: </w:t>
-      </w:r>
-      <w:r>
-        <w:t>[LAST UPDATED DATE]</w:t>
-      </w:r>
-      <w:r>
-        <w:t xml:space="preserve">  ·  Website slug for admin CMS: </w:t>
+        <w:t xml:space="preserve">  ·  CMS slug: </w:t>
       </w:r>
       <w:r>
         <w:rPr>
@@ -96,18 +58,41 @@
         </w:rPr>
         <w:t>privacy</w:t>
       </w:r>
-    </w:p>
-    <w:p/>
-    <w:p>
       <w:r>
-        <w:rPr>
-          <w:i/>
-          <w:color w:val="555555"/>
-          <w:sz w:val="18"/>
-        </w:rPr>
-        <w:t>DRAFT — NOT LEGAL ADVICE. Have a qualified Ghana lawyer review before publishing. Replace all [BRACKETED] placeholders, then paste into Admin → Legal policies or publish as PDF on your site.</w:t>
+        <w:t xml:space="preserve">  ·  Public URL: </w:t>
+      </w:r>
+      <w:r>
+        <w:t>https://danypathmart.store/policies/privacy</w:t>
       </w:r>
     </w:p>
+    <w:tbl>
+      <w:tblPr>
+        <w:tblStyle w:val="TableGrid"/>
+        <w:tblW w:type="auto" w:w="0"/>
+        <w:tblLook w:firstColumn="1" w:firstRow="1" w:lastColumn="0" w:lastRow="0" w:noHBand="0" w:noVBand="1" w:val="04A0"/>
+      </w:tblPr>
+      <w:tblGrid>
+        <w:gridCol w:w="8640"/>
+      </w:tblGrid>
+      <w:tr>
+        <w:tc>
+          <w:tcPr>
+            <w:tcW w:type="dxa" w:w="8640"/>
+            <w:shd w:fill="FFF3E0"/>
+          </w:tcPr>
+          <w:p>
+            <w:r>
+              <w:rPr>
+                <w:i/>
+                <w:color w:val="555555"/>
+                <w:sz w:val="20"/>
+              </w:rPr>
+              <w:t>Operating status: DanyPathMart is currently run as an online business at https://danypathmart.store and is not yet formally registered in Ghana. Policies will be updated when registration is completed. Not legal advice — have a qualified Ghana lawyer review before heavy marketing.</w:t>
+            </w:r>
+          </w:p>
+        </w:tc>
+      </w:tr>
+    </w:tbl>
     <w:p/>
     <w:p>
       <w:pPr>
@@ -119,335 +104,248 @@
     </w:p>
     <w:p>
       <w:r>
-        <w:t>[COMPANY LEGAL NAME] ([TRADING NAME / BRAND NAME]), registered in Ghana (Company No. [RGD COMPANY NUMBER]), with registered office at [REGISTERED OFFICE ADDRESS] and contact email [SUPPORT EMAIL], phone [SUPPORT PHONE], website [YOUR WEBSITE URL] ("we", "us", "our").</w:t>
+        <w:rPr>
+          <w:i w:val="0"/>
+          <w:sz w:val="22"/>
+        </w:rPr>
+        <w:t>DanyPathMart ("DPM") processes personal data to operate our online platform at https://danypathmart.store, fulfil DPM orders, host shop storefronts, and provide support.</w:t>
       </w:r>
     </w:p>
+    <w:tbl>
+      <w:tblPr>
+        <w:tblStyle w:val="TableGrid"/>
+        <w:tblW w:type="auto" w:w="0"/>
+        <w:tblLook w:firstColumn="1" w:firstRow="1" w:lastColumn="0" w:lastRow="0" w:noHBand="0" w:noVBand="1" w:val="04A0"/>
+      </w:tblPr>
+      <w:tblGrid>
+        <w:gridCol w:w="8640"/>
+      </w:tblGrid>
+      <w:tr>
+        <w:tc>
+          <w:tcPr>
+            <w:tcW w:type="dxa" w:w="8640"/>
+            <w:shd w:fill="FFF3E0"/>
+          </w:tcPr>
+          <w:p>
+            <w:r>
+              <w:rPr>
+                <w:i/>
+                <w:color w:val="555555"/>
+                <w:sz w:val="20"/>
+              </w:rPr>
+              <w:t>Operating status: DPM is currently operated as an online business and is not yet formally registered with Ghanaian authorities. We plan to complete formal registration as the platform grows and will update this policy when our legal entity details change (including any registration number or registered address).</w:t>
+            </w:r>
+          </w:p>
+        </w:tc>
+      </w:tr>
+    </w:tbl>
+    <w:p/>
     <w:p>
       <w:r>
-        <w:t>This Privacy Policy explains how we collect, use, store, and share personal data when you use our Platform, in accordance with the Ghana Data Protection Act, 2012 (Act 843) and applicable regulations.</w:t>
+        <w:rPr>
+          <w:i w:val="0"/>
+          <w:sz w:val="22"/>
+        </w:rPr>
+        <w:t>Data controller: DanyPathMart (operating online at danypathmart.store). For privacy requests, use the Contact page on the site.</w:t>
       </w:r>
     </w:p>
-    <w:p/>
     <w:p>
       <w:pPr>
         <w:pStyle w:val="Heading2"/>
       </w:pPr>
       <w:r>
-        <w:t>2. Data controller</w:t>
+        <w:t>2. Data we collect</w:t>
       </w:r>
     </w:p>
     <w:p>
       <w:r>
-        <w:t>The data controller is [COMPANY LEGAL NAME]. Data protection contact: [DATA PROTECTION OFFICER EMAIL].</w:t>
+        <w:rPr>
+          <w:i w:val="0"/>
+          <w:sz w:val="22"/>
+        </w:rPr>
+        <w:t>Account data: name, email, phone, password (hashed), addresses, order history.</w:t>
       </w:r>
     </w:p>
     <w:p>
       <w:r>
-        <w:t>If required, we are registered with the Data Protection Commission (DPC), Ghana — Registration reference: [DPC REGISTRATION REFERENCE (if applicable)].</w:t>
+        <w:rPr>
+          <w:i w:val="0"/>
+          <w:sz w:val="22"/>
+        </w:rPr>
+        <w:t>Shop sellers: business name, contact details, location (if you add a map pin), bank/MoMo details you provide, payment settings, subscription billing records.</w:t>
       </w:r>
     </w:p>
-    <w:p/>
+    <w:p>
+      <w:r>
+        <w:rPr>
+          <w:i w:val="0"/>
+          <w:sz w:val="22"/>
+        </w:rPr>
+        <w:t>Orders: items, totals, payment status, delivery or pickup choices, notes.</w:t>
+      </w:r>
+    </w:p>
+    <w:p>
+      <w:r>
+        <w:rPr>
+          <w:i w:val="0"/>
+          <w:sz w:val="22"/>
+        </w:rPr>
+        <w:t>Technical data: device/browser data, cookies (see Cookies Policy), security logs.</w:t>
+      </w:r>
+    </w:p>
     <w:p>
       <w:pPr>
         <w:pStyle w:val="Heading2"/>
       </w:pPr>
       <w:r>
-        <w:t>3. Personal data we collect</w:t>
+        <w:t>3. How we use data</w:t>
       </w:r>
     </w:p>
     <w:p>
-      <w:pPr>
-        <w:pStyle w:val="ListBullet"/>
-      </w:pPr>
       <w:r>
-        <w:t>Identity &amp; contact: name, email, phone, delivery address</w:t>
+        <w:rPr>
+          <w:i w:val="0"/>
+          <w:sz w:val="22"/>
+        </w:rPr>
+        <w:t>To process orders and payments, deliver or coordinate fulfilment, send order and subscription reminders, operate shop billing, investigate reports, enforce policies, and improve the service.</w:t>
       </w:r>
     </w:p>
-    <w:p>
-      <w:pPr>
-        <w:pStyle w:val="ListBullet"/>
-      </w:pPr>
-      <w:r>
-        <w:t>Account: username, password (hashed), preferences, verification status</w:t>
-      </w:r>
-    </w:p>
-    <w:p>
-      <w:pPr>
-        <w:pStyle w:val="ListBullet"/>
-      </w:pPr>
-      <w:r>
-        <w:t>Order &amp; payment: order history, amounts, transaction references (payment card/MoMo details are processed by Paystack — we do not store full card numbers)</w:t>
-      </w:r>
-    </w:p>
-    <w:p>
-      <w:pPr>
-        <w:pStyle w:val="ListBullet"/>
-      </w:pPr>
-      <w:r>
-        <w:t>Shop sellers: business name, payout details (bank/MoMo), application documents if provided</w:t>
-      </w:r>
-    </w:p>
-    <w:p>
-      <w:pPr>
-        <w:pStyle w:val="ListBullet"/>
-      </w:pPr>
-      <w:r>
-        <w:t>Communications: support chat, emails, complaints</w:t>
-      </w:r>
-    </w:p>
-    <w:p>
-      <w:pPr>
-        <w:pStyle w:val="ListBullet"/>
-      </w:pPr>
-      <w:r>
-        <w:t>Technical: IP address, device/browser type, cookies (see Cookies Policy)</w:t>
-      </w:r>
-    </w:p>
-    <w:p>
-      <w:pPr>
-        <w:pStyle w:val="ListBullet"/>
-      </w:pPr>
-      <w:r>
-        <w:t>Optional: profile photo, social login identifiers if you use OAuth</w:t>
-      </w:r>
-    </w:p>
-    <w:p/>
     <w:p>
       <w:pPr>
         <w:pStyle w:val="Heading2"/>
       </w:pPr>
       <w:r>
-        <w:t>4. How we use data</w:t>
+        <w:t>4. Shop orders and shared data</w:t>
       </w:r>
     </w:p>
     <w:p>
-      <w:pPr>
-        <w:pStyle w:val="ListBullet"/>
-      </w:pPr>
       <w:r>
-        <w:t>Provide the Platform, process orders, and deliver products</w:t>
+        <w:rPr>
+          <w:i w:val="0"/>
+          <w:sz w:val="22"/>
+        </w:rPr>
+        <w:t>When you buy from a shop storefront, we share fulfilment data with that shop (name, contact, delivery address or pickup arrangement, order items). Shops must use this data only to fulfil the order and handle support for that order.</w:t>
       </w:r>
     </w:p>
-    <w:p>
-      <w:pPr>
-        <w:pStyle w:val="ListBullet"/>
-      </w:pPr>
-      <w:r>
-        <w:t>Verify identity, prevent fraud, and secure accounts</w:t>
-      </w:r>
-    </w:p>
-    <w:p>
-      <w:pPr>
-        <w:pStyle w:val="ListBullet"/>
-      </w:pPr>
-      <w:r>
-        <w:t>Customer support and dispute resolution</w:t>
-      </w:r>
-    </w:p>
-    <w:p>
-      <w:pPr>
-        <w:pStyle w:val="ListBullet"/>
-      </w:pPr>
-      <w:r>
-        <w:t>Shop onboarding, billing, and payouts</w:t>
-      </w:r>
-    </w:p>
-    <w:p>
-      <w:pPr>
-        <w:pStyle w:val="ListBullet"/>
-      </w:pPr>
-      <w:r>
-        <w:t>Legal, tax, and regulatory compliance</w:t>
-      </w:r>
-    </w:p>
-    <w:p>
-      <w:pPr>
-        <w:pStyle w:val="ListBullet"/>
-      </w:pPr>
-      <w:r>
-        <w:t>Improve the Platform and send service messages (order updates)</w:t>
-      </w:r>
-    </w:p>
-    <w:p>
-      <w:pPr>
-        <w:pStyle w:val="ListBullet"/>
-      </w:pPr>
-      <w:r>
-        <w:t>Marketing only where you have opted in — you may opt out anytime</w:t>
-      </w:r>
-    </w:p>
-    <w:p/>
     <w:p>
       <w:pPr>
         <w:pStyle w:val="Heading2"/>
       </w:pPr>
       <w:r>
-        <w:t>5. Legal bases</w:t>
+        <w:t>5. Payments</w:t>
       </w:r>
     </w:p>
     <w:p>
       <w:r>
-        <w:t>We process data based on: performance of a contract; legitimate interests (security, improvement); legal obligation; and consent where required (e.g. marketing cookies).</w:t>
+        <w:rPr>
+          <w:i w:val="0"/>
+          <w:sz w:val="22"/>
+        </w:rPr>
+        <w:t>DPM catalog payments are processed by Paystack or other enabled providers. Shop Paystack payments are processed to the shop's connected account. We do not store full card numbers.</w:t>
       </w:r>
     </w:p>
-    <w:p/>
     <w:p>
       <w:pPr>
         <w:pStyle w:val="Heading2"/>
       </w:pPr>
       <w:r>
-        <w:t>6. Sharing data</w:t>
+        <w:t>6. Reports and moderation</w:t>
       </w:r>
     </w:p>
     <w:p>
       <w:r>
-        <w:t>We may share data with:</w:t>
+        <w:rPr>
+          <w:i w:val="0"/>
+          <w:sz w:val="22"/>
+        </w:rPr>
+        <w:t>Report content and caution records are kept for trust and safety. Reporter identity is not shown to shops by default.</w:t>
       </w:r>
     </w:p>
-    <w:p>
-      <w:pPr>
-        <w:pStyle w:val="ListBullet"/>
-      </w:pPr>
-      <w:r>
-        <w:t>Payment processor: Paystack ([PAYSTACK BUSINESS NAME]) for payments</w:t>
-      </w:r>
-    </w:p>
-    <w:p>
-      <w:pPr>
-        <w:pStyle w:val="ListBullet"/>
-      </w:pPr>
-      <w:r>
-        <w:t>Delivery/logistics partners to fulfil orders</w:t>
-      </w:r>
-    </w:p>
-    <w:p>
-      <w:pPr>
-        <w:pStyle w:val="ListBullet"/>
-      </w:pPr>
-      <w:r>
-        <w:t>Shop sellers — only information needed to fulfil shop orders (e.g. name, phone, address for delivery)</w:t>
-      </w:r>
-    </w:p>
-    <w:p>
-      <w:pPr>
-        <w:pStyle w:val="ListBullet"/>
-      </w:pPr>
-      <w:r>
-        <w:t>Hosting, email, and analytics providers under contract</w:t>
-      </w:r>
-    </w:p>
-    <w:p>
-      <w:pPr>
-        <w:pStyle w:val="ListBullet"/>
-      </w:pPr>
-      <w:r>
-        <w:t>Regulators, courts, or law enforcement when required by law</w:t>
-      </w:r>
-    </w:p>
-    <w:p>
-      <w:r>
-        <w:t>We do not sell your personal data.</w:t>
-      </w:r>
-    </w:p>
-    <w:p/>
     <w:p>
       <w:pPr>
         <w:pStyle w:val="Heading2"/>
       </w:pPr>
       <w:r>
-        <w:t>7. International transfers</w:t>
+        <w:t>7. Retention</w:t>
       </w:r>
     </w:p>
     <w:p>
       <w:r>
-        <w:t>Some providers may process data outside Ghana. Where this occurs, we use appropriate safeguards as required by law.</w:t>
+        <w:rPr>
+          <w:i w:val="0"/>
+          <w:sz w:val="22"/>
+        </w:rPr>
+        <w:t>We retain data as needed for operational, accounting, and legal purposes, then delete or anonymise where appropriate.</w:t>
       </w:r>
     </w:p>
-    <w:p/>
     <w:p>
       <w:pPr>
         <w:pStyle w:val="Heading2"/>
       </w:pPr>
       <w:r>
-        <w:t>8. Retention</w:t>
+        <w:t>8. Your rights</w:t>
       </w:r>
     </w:p>
     <w:p>
       <w:r>
-        <w:t>We keep personal data only as long as needed for the purposes above, including legal/tax retention periods (typically [DATA RETENTION PERIOD] for order records unless longer retention is required by law).</w:t>
+        <w:rPr>
+          <w:i w:val="0"/>
+          <w:sz w:val="22"/>
+        </w:rPr>
+        <w:t>You may request access, correction, or deletion of your personal data where applicable. Contact us via the Contact page at https://danypathmart.store.</w:t>
       </w:r>
     </w:p>
-    <w:p/>
     <w:p>
       <w:pPr>
         <w:pStyle w:val="Heading2"/>
       </w:pPr>
       <w:r>
-        <w:t>9. Security</w:t>
+        <w:t>9. Data protection registration</w:t>
       </w:r>
     </w:p>
     <w:p>
       <w:r>
-        <w:t>We use HTTPS, access controls, staff permissions, and other measures appropriate to the risk. No system is 100% secure — report concerns to [DATA PROTECTION OFFICER EMAIL].</w:t>
+        <w:rPr>
+          <w:i w:val="0"/>
+          <w:sz w:val="22"/>
+        </w:rPr>
+        <w:t>We are not yet registered with the Data Protection Commission (DPC), Ghana. We handle personal data responsibly and plan to align with DPC requirements when formal business registration is completed.</w:t>
       </w:r>
     </w:p>
-    <w:p/>
     <w:p>
       <w:pPr>
         <w:pStyle w:val="Heading2"/>
       </w:pPr>
       <w:r>
-        <w:t>10. Your rights</w:t>
+        <w:t>10. Security</w:t>
       </w:r>
     </w:p>
     <w:p>
       <w:r>
-        <w:t>Subject to Act 843, you may request access, correction, deletion, or restriction of processing, and object to certain processing. Contact [DATA PROTECTION OFFICER EMAIL]. You may lodge a complaint with the Data Protection Commission, Ghana.</w:t>
+        <w:rPr>
+          <w:i w:val="0"/>
+          <w:sz w:val="22"/>
+        </w:rPr>
+        <w:t>We use reasonable technical and organisational measures. No system is 100% secure.</w:t>
       </w:r>
     </w:p>
-    <w:p/>
     <w:p>
       <w:pPr>
         <w:pStyle w:val="Heading2"/>
       </w:pPr>
       <w:r>
-        <w:t>11. Children</w:t>
+        <w:t>11. Changes</w:t>
       </w:r>
     </w:p>
     <w:p>
       <w:r>
-        <w:t>The Platform is not directed at children under 13 without parental consent. Contact us to remove a child's data if collected in error.</w:t>
+        <w:rPr>
+          <w:i w:val="0"/>
+          <w:sz w:val="22"/>
+        </w:rPr>
+        <w:t>We will post updates on this page with a revised "Last updated" date.</w:t>
       </w:r>
     </w:p>
-    <w:p/>
-    <w:p>
-      <w:pPr>
-        <w:pStyle w:val="Heading2"/>
-      </w:pPr>
-      <w:r>
-        <w:t>12. Changes</w:t>
-      </w:r>
-    </w:p>
-    <w:p>
-      <w:r>
-        <w:t>We may update this policy. Check [LAST UPDATED DATE] at the top. Material changes will be notified on the Platform.</w:t>
-      </w:r>
-    </w:p>
-    <w:p/>
-    <w:p>
-      <w:pPr>
-        <w:pStyle w:val="Heading2"/>
-      </w:pPr>
-      <w:r>
-        <w:t>13. Contact</w:t>
-      </w:r>
-    </w:p>
-    <w:p>
-      <w:r>
-        <w:t>[DATA PROTECTION OFFICER EMAIL] · [SUPPORT EMAIL] · [SUPPORT PHONE]</w:t>
-      </w:r>
-    </w:p>
-    <w:p/>
     <w:sectPr>
       <w:pgSz w:w="12240" w:h="15840"/>
       <w:pgMar w:top="1440" w:right="1800" w:bottom="1440" w:left="1800" w:header="720" w:footer="720" w:gutter="0"/>

</xml_diff>